<commit_message>
docs: cover audit phase in AI prompts log
</commit_message>
<xml_diff>
--- a/docs/AI_Prompts.docx
+++ b/docs/AI_Prompts.docx
@@ -364,6 +364,50 @@
       </w:pPr>
       <w:r>
         <w:t xml:space="preserve">Is everything merged to main? Push. Write this AI_Prompts.docx file in docs.</w:t>
+      </w:r>
+    </w:p>
+    <w:p>
+      <w:pPr>
+        <w:pStyle w:val="Heading2"/>
+      </w:pPr>
+      <w:r>
+        <w:t xml:space="preserve">2.5 Pre-submission senior audit (10-point brief, all test-driven)</w:t>
+      </w:r>
+    </w:p>
+    <w:p>
+      <w:pPr>
+        <w:pStyle w:val="ListParagraph"/>
+        <w:numPr>
+          <w:ilvl w:val="0"/>
+          <w:numId w:val="2"/>
+        </w:numPr>
+      </w:pPr>
+      <w:r>
+        <w:t xml:space="preserve">Audit the repository as a senior engineer for assessment submission: architecture correctness, reliability, maintainability, coverage, docs, readiness — fix the 10 listed items, no new product features.</w:t>
+      </w:r>
+    </w:p>
+    <w:p>
+      <w:pPr>
+        <w:pStyle w:val="ListParagraph"/>
+        <w:numPr>
+          <w:ilvl w:val="0"/>
+          <w:numId w:val="2"/>
+        </w:numPr>
+      </w:pPr>
+      <w:r>
+        <w:t xml:space="preserve">Go audit — delivered: Alert AI-patch routed through the alerts repository (updateAlertMessage); accurate reject reasons (required vs invalid); LLM_PROVIDER_NOT_IMPLEMENTED warn for the unconfigured openai value; simulator default false (compose still enables the demo) plus stopSimulator and a drained shutdown; real readiness health (200 connected / 503 disconnected) plus a backend compose healthcheck; visible dismissible resolve-failure banner (also fixed test-DOM leakage from missing cleanup without vitest globals); clean ingest CLI errors; architecture and README drift sync; new GitHub Actions CI.</w:t>
+      </w:r>
+    </w:p>
+    <w:p>
+      <w:pPr>
+        <w:pStyle w:val="ListParagraph"/>
+        <w:numPr>
+          <w:ilvl w:val="0"/>
+          <w:numId w:val="2"/>
+        </w:numPr>
+      </w:pPr>
+      <w:r>
+        <w:t xml:space="preserve">Run-it runbooks and rerun cheat-sheets (compose, local-dev, and live-AI variants); diagnosed pasted failures from logs; model fix follow-through and pushes to origin/main; then update these prompt logs.</w:t>
       </w:r>
     </w:p>
     <w:p>

</xml_diff>

<commit_message>
docs: cover review polish in AI prompts log
</commit_message>
<xml_diff>
--- a/docs/AI_Prompts.docx
+++ b/docs/AI_Prompts.docx
@@ -408,6 +408,50 @@
       </w:pPr>
       <w:r>
         <w:t xml:space="preserve">Run-it runbooks and rerun cheat-sheets (compose, local-dev, and live-AI variants); diagnosed pasted failures from logs; model fix follow-through and pushes to origin/main; then update these prompt logs.</w:t>
+      </w:r>
+    </w:p>
+    <w:p>
+      <w:pPr>
+        <w:pStyle w:val="Heading2"/>
+      </w:pPr>
+      <w:r>
+        <w:t xml:space="preserve">2.6 External review polish (README 9.2/10)</w:t>
+      </w:r>
+    </w:p>
+    <w:p>
+      <w:pPr>
+        <w:pStyle w:val="ListParagraph"/>
+        <w:numPr>
+          <w:ilvl w:val="0"/>
+          <w:numId w:val="2"/>
+        </w:numPr>
+      </w:pPr>
+      <w:r>
+        <w:t xml:space="preserve">Applied a 6-item polish review: ASCII architecture diagram in README, exact versioned-vs-alias wording, three-way response-envelope docs, neutral Gemini-key wording, Quality Gates section mirroring CI plus a status badge, and a Key Engineering Decisions section.</w:t>
+      </w:r>
+    </w:p>
+    <w:p>
+      <w:pPr>
+        <w:pStyle w:val="ListParagraph"/>
+        <w:numPr>
+          <w:ilvl w:val="0"/>
+          <w:numId w:val="2"/>
+        </w:numPr>
+      </w:pPr>
+      <w:r>
+        <w:t xml:space="preserve">Cleaned architecture.md for submission: Email section reduced to a deferred note, Implementation Sequence and Submission Checklist removed (old section 27 renumbered to 25, no dangling cross-references).</w:t>
+      </w:r>
+    </w:p>
+    <w:p>
+      <w:pPr>
+        <w:pStyle w:val="ListParagraph"/>
+        <w:numPr>
+          <w:ilvl w:val="0"/>
+          <w:numId w:val="2"/>
+        </w:numPr>
+      </w:pPr>
+      <w:r>
+        <w:t xml:space="preserve">Then updated these prompt logs (markdown plus docx) to match.</w:t>
       </w:r>
     </w:p>
     <w:p>

</xml_diff>

<commit_message>
docs: cover product refactor in AI prompts log
</commit_message>
<xml_diff>
--- a/docs/AI_Prompts.docx
+++ b/docs/AI_Prompts.docx
@@ -440,6 +440,86 @@
       </w:pPr>
       <w:r>
         <w:t xml:space="preserve">Cleaned architecture.md for submission: Email section reduced to a deferred note, Implementation Sequence and Submission Checklist removed (old section 27 renumbered to 25, no dangling cross-references).</w:t>
+      </w:r>
+    </w:p>
+    <w:p>
+      <w:pPr>
+        <w:pStyle w:val="ListParagraph"/>
+        <w:numPr>
+          <w:ilvl w:val="0"/>
+          <w:numId w:val="2"/>
+        </w:numPr>
+      </w:pPr>
+      <w:r>
+        <w:t xml:space="preserve">Then updated these prompt logs (markdown plus docx) to match.</w:t>
+      </w:r>
+    </w:p>
+    <w:p>
+      <w:pPr>
+        <w:pStyle w:val="Heading2"/>
+      </w:pPr>
+      <w:r>
+        <w:t xml:space="preserve">2.7 Assessment-to-product refactor (no core redesign)</w:t>
+      </w:r>
+    </w:p>
+    <w:p>
+      <w:pPr>
+        <w:pStyle w:val="ListParagraph"/>
+        <w:numPr>
+          <w:ilvl w:val="0"/>
+          <w:numId w:val="2"/>
+        </w:numPr>
+      </w:pPr>
+      <w:r>
+        <w:t xml:space="preserve">Refactor the repository from assessment submission into a reusable, production-minded modular monolith: no new infrastructure, no behavior changes.</w:t>
+      </w:r>
+    </w:p>
+    <w:p>
+      <w:pPr>
+        <w:pStyle w:val="ListParagraph"/>
+        <w:numPr>
+          <w:ilvl w:val="0"/>
+          <w:numId w:val="2"/>
+        </w:numPr>
+      </w:pPr>
+      <w:r>
+        <w:t xml:space="preserve">Removed assessment language (README Submission section, 5-day and deadline wording, assignment PDF); kept development history intentionally.</w:t>
+      </w:r>
+    </w:p>
+    <w:p>
+      <w:pPr>
+        <w:pStyle w:val="ListParagraph"/>
+        <w:numPr>
+          <w:ilvl w:val="0"/>
+          <w:numId w:val="2"/>
+        </w:numPr>
+      </w:pPr>
+      <w:r>
+        <w:t xml:space="preserve">Rewrote README to the product structure and retitled architecture.md to SentraPulse System Architecture.</w:t>
+      </w:r>
+    </w:p>
+    <w:p>
+      <w:pPr>
+        <w:pStyle w:val="ListParagraph"/>
+        <w:numPr>
+          <w:ilvl w:val="0"/>
+          <w:numId w:val="2"/>
+        </w:numPr>
+      </w:pPr>
+      <w:r>
+        <w:t xml:space="preserve">Added docs/adr/0001-0005, ISC LICENSE, CONTRIBUTING.md, SECURITY.md.</w:t>
+      </w:r>
+    </w:p>
+    <w:p>
+      <w:pPr>
+        <w:pStyle w:val="ListParagraph"/>
+        <w:numPr>
+          <w:ilvl w:val="0"/>
+          <w:numId w:val="2"/>
+        </w:numPr>
+      </w:pPr>
+      <w:r>
+        <w:t xml:space="preserve">Verified: backend npm ci plus lint plus tsc plus 57 tests plus build; frontend npm ci plus lint plus 12 tests plus build; docker compose build and live up with health connected and a live AI incident.</w:t>
       </w:r>
     </w:p>
     <w:p>

</xml_diff>